<commit_message>
Updates, fixed logos, updated readme files
</commit_message>
<xml_diff>
--- a/Rubber Ducky/Szymon Stefański/Penetration testing research report (Ducky).docx
+++ b/Rubber Ducky/Szymon Stefański/Penetration testing research report (Ducky).docx
@@ -53,7 +53,7 @@
             <wp:extent cx="5753100" cy="1770380"/>
             <wp:effectExtent b="0" l="0" r="0" t="0"/>
             <wp:wrapSquare wrapText="bothSides" distB="0" distT="0" distL="0" distR="0"/>
-            <wp:docPr id="2" name="image3.png"/>
+            <wp:docPr id="3" name="image3.png"/>
             <a:graphic>
               <a:graphicData uri="http://schemas.openxmlformats.org/drawingml/2006/picture">
                 <pic:pic>
@@ -93,23 +93,14 @@
       </w:pPr>
       <w:r>
         <w:rPr>
-          <w:rtl w:val="0"/>
-        </w:rPr>
-      </w:r>
-      <w:r>
+          <w:sz w:val="22"/>
+          <w:szCs w:val="22"/>
+        </w:rPr>
         <w:drawing>
-          <wp:anchor allowOverlap="1" behindDoc="0" distB="114300" distT="114300" distL="114300" distR="114300" hidden="0" layoutInCell="1" locked="0" relativeHeight="0" simplePos="0">
-            <wp:simplePos x="0" y="0"/>
-            <wp:positionH relativeFrom="column">
-              <wp:posOffset>504825</wp:posOffset>
-            </wp:positionH>
-            <wp:positionV relativeFrom="paragraph">
-              <wp:posOffset>809625</wp:posOffset>
-            </wp:positionV>
-            <wp:extent cx="4914583" cy="981075"/>
+          <wp:inline distB="114300" distT="114300" distL="114300" distR="114300">
+            <wp:extent cx="5760410" cy="4076700"/>
             <wp:effectExtent b="0" l="0" r="0" t="0"/>
-            <wp:wrapSquare wrapText="bothSides" distB="114300" distT="114300" distL="114300" distR="114300"/>
-            <wp:docPr id="3" name="image2.png"/>
+            <wp:docPr id="2" name="image2.png"/>
             <a:graphic>
               <a:graphicData uri="http://schemas.openxmlformats.org/drawingml/2006/picture">
                 <pic:pic>
@@ -127,7 +118,7 @@
                   <pic:spPr>
                     <a:xfrm>
                       <a:off x="0" y="0"/>
-                      <a:ext cx="4914583" cy="981075"/>
+                      <a:ext cx="5760410" cy="4076700"/>
                     </a:xfrm>
                     <a:prstGeom prst="rect"/>
                     <a:ln/>
@@ -135,8 +126,13 @@
                 </pic:pic>
               </a:graphicData>
             </a:graphic>
-          </wp:anchor>
+          </wp:inline>
         </w:drawing>
+      </w:r>
+      <w:r>
+        <w:rPr>
+          <w:rtl w:val="0"/>
+        </w:rPr>
       </w:r>
     </w:p>
     <w:p>
@@ -215,6 +211,13 @@
         <w:ind w:left="0" w:right="0" w:firstLine="0"/>
         <w:jc w:val="center"/>
         <w:rPr>
+          <w:color w:val="156082"/>
+          <w:sz w:val="28"/>
+          <w:szCs w:val="28"/>
+        </w:rPr>
+      </w:pPr>
+      <w:r>
+        <w:rPr>
           <w:rFonts w:ascii="Aptos" w:cs="Aptos" w:eastAsia="Aptos" w:hAnsi="Aptos"/>
           <w:b w:val="0"/>
           <w:bCs w:val="0"/>
@@ -228,26 +231,14 @@
           <w:u w:val="none"/>
           <w:shd w:fill="auto" w:val="clear"/>
           <w:vertAlign w:val="baseline"/>
-        </w:rPr>
-      </w:pPr>
-      <w:r>
-        <w:rPr>
-          <w:rFonts w:ascii="Aptos" w:cs="Aptos" w:eastAsia="Aptos" w:hAnsi="Aptos"/>
-          <w:b w:val="0"/>
-          <w:bCs w:val="0"/>
-          <w:i w:val="0"/>
-          <w:iCs w:val="0"/>
-          <w:smallCaps w:val="0"/>
-          <w:strike w:val="0"/>
-          <w:color w:val="156082"/>
-          <w:sz w:val="28"/>
-          <w:szCs w:val="28"/>
-          <w:u w:val="none"/>
-          <w:shd w:fill="auto" w:val="clear"/>
-          <w:vertAlign w:val="baseline"/>
           <w:rtl w:val="0"/>
         </w:rPr>
         <w:t xml:space="preserve">USB Rubber Ducky 3.0 - Browser Data Exfiltration via HID Injection PowerShell Staged Payload Attack</w:t>
+      </w:r>
+      <w:r>
+        <w:rPr>
+          <w:rtl w:val="0"/>
+        </w:rPr>
       </w:r>
     </w:p>
     <w:p>
@@ -357,7 +348,7 @@
                   <wp:posOffset>-401157</wp:posOffset>
                 </wp:positionH>
                 <wp:positionV relativeFrom="page">
-                  <wp:posOffset>8672513</wp:posOffset>
+                  <wp:posOffset>1614488</wp:posOffset>
                 </wp:positionV>
                 <wp:extent cx="6562725" cy="981075"/>
                 <wp:effectExtent b="0" l="0" r="0" t="0"/>
@@ -555,7 +546,7 @@
                   <wp:posOffset>-401157</wp:posOffset>
                 </wp:positionH>
                 <wp:positionV relativeFrom="page">
-                  <wp:posOffset>8672513</wp:posOffset>
+                  <wp:posOffset>1614488</wp:posOffset>
                 </wp:positionV>
                 <wp:extent cx="6562725" cy="981075"/>
                 <wp:effectExtent b="0" l="0" r="0" t="0"/>
@@ -728,7 +719,7 @@
     </w:p>
     <w:sdt>
       <w:sdtPr>
-        <w:id w:val="-723369832"/>
+        <w:id w:val="822816396"/>
         <w:docPartObj>
           <w:docPartGallery w:val="Table of Contents"/>
           <w:docPartUnique w:val="1"/>
@@ -3678,7 +3669,18 @@
           <w:vertAlign w:val="baseline"/>
           <w:rtl w:val="0"/>
         </w:rPr>
-        <w:t xml:space="preserve">MITRE ATT&amp;CK Framework</w:t>
+        <w:t xml:space="preserve">MITRE ATT&amp;CK</w:t>
+      </w:r>
+      <w:r>
+        <w:rPr>
+          <w:rtl w:val="0"/>
+        </w:rPr>
+        <w:t xml:space="preserve"> ( Input Injection )</w:t>
+      </w:r>
+      <w:r>
+        <w:rPr>
+          <w:rtl w:val="0"/>
+        </w:rPr>
       </w:r>
     </w:p>
     <w:p>
@@ -3689,11 +3691,11 @@
       <w:hyperlink r:id="rId14">
         <w:r>
           <w:rPr>
-            <w:color w:val="467886"/>
+            <w:color w:val="1155cc"/>
             <w:u w:val="single"/>
             <w:rtl w:val="0"/>
           </w:rPr>
-          <w:t xml:space="preserve">https://attack.mitre.org</w:t>
+          <w:t xml:space="preserve">https://attack.mitre.org/techniques/T1674/</w:t>
         </w:r>
       </w:hyperlink>
       <w:r>

</xml_diff>

<commit_message>
Fixed title page bug
</commit_message>
<xml_diff>
--- a/Rubber Ducky/Szymon Stefański/Penetration testing research report (Ducky).docx
+++ b/Rubber Ducky/Szymon Stefański/Penetration testing research report (Ducky).docx
@@ -53,12 +53,12 @@
             <wp:extent cx="5753100" cy="1770380"/>
             <wp:effectExtent b="0" l="0" r="0" t="0"/>
             <wp:wrapSquare wrapText="bothSides" distB="0" distT="0" distL="0" distR="0"/>
-            <wp:docPr id="3" name="image3.png"/>
+            <wp:docPr id="3" name="image4.png"/>
             <a:graphic>
               <a:graphicData uri="http://schemas.openxmlformats.org/drawingml/2006/picture">
                 <pic:pic>
                   <pic:nvPicPr>
-                    <pic:cNvPr id="0" name="image3.png"/>
+                    <pic:cNvPr id="0" name="image4.png"/>
                     <pic:cNvPicPr preferRelativeResize="0"/>
                   </pic:nvPicPr>
                   <pic:blipFill>
@@ -100,12 +100,12 @@
           <wp:inline distB="114300" distT="114300" distL="114300" distR="114300">
             <wp:extent cx="5760410" cy="4076700"/>
             <wp:effectExtent b="0" l="0" r="0" t="0"/>
-            <wp:docPr id="2" name="image2.png"/>
+            <wp:docPr id="2" name="image3.png"/>
             <a:graphic>
               <a:graphicData uri="http://schemas.openxmlformats.org/drawingml/2006/picture">
                 <pic:pic>
                   <pic:nvPicPr>
-                    <pic:cNvPr id="0" name="image2.png"/>
+                    <pic:cNvPr id="0" name="image3.png"/>
                     <pic:cNvPicPr preferRelativeResize="0"/>
                   </pic:nvPicPr>
                   <pic:blipFill>
@@ -348,7 +348,7 @@
                   <wp:posOffset>-401157</wp:posOffset>
                 </wp:positionH>
                 <wp:positionV relativeFrom="page">
-                  <wp:posOffset>1614488</wp:posOffset>
+                  <wp:posOffset>8758238</wp:posOffset>
                 </wp:positionV>
                 <wp:extent cx="6562725" cy="981075"/>
                 <wp:effectExtent b="0" l="0" r="0" t="0"/>
@@ -546,7 +546,7 @@
                   <wp:posOffset>-401157</wp:posOffset>
                 </wp:positionH>
                 <wp:positionV relativeFrom="page">
-                  <wp:posOffset>1614488</wp:posOffset>
+                  <wp:posOffset>8758238</wp:posOffset>
                 </wp:positionV>
                 <wp:extent cx="6562725" cy="981075"/>
                 <wp:effectExtent b="0" l="0" r="0" t="0"/>
@@ -719,7 +719,7 @@
     </w:p>
     <w:sdt>
       <w:sdtPr>
-        <w:id w:val="822816396"/>
+        <w:id w:val="-1050583386"/>
         <w:docPartObj>
           <w:docPartGallery w:val="Table of Contents"/>
           <w:docPartUnique w:val="1"/>
@@ -2851,12 +2851,12 @@
           <wp:inline distB="0" distT="0" distL="0" distR="0">
             <wp:extent cx="5346700" cy="6184900"/>
             <wp:effectExtent b="0" l="0" r="0" t="0"/>
-            <wp:docPr id="4" name="image4.png"/>
+            <wp:docPr id="4" name="image2.png"/>
             <a:graphic>
               <a:graphicData uri="http://schemas.openxmlformats.org/drawingml/2006/picture">
                 <pic:pic>
                   <pic:nvPicPr>
-                    <pic:cNvPr id="0" name="image4.png"/>
+                    <pic:cNvPr id="0" name="image2.png"/>
                     <pic:cNvPicPr preferRelativeResize="0"/>
                   </pic:nvPicPr>
                   <pic:blipFill>

</xml_diff>